<commit_message>
merge Used resources.docx into report.docx
</commit_message>
<xml_diff>
--- a/6.Testing Evidence/Testing documentation.docx
+++ b/6.Testing Evidence/Testing documentation.docx
@@ -30,25 +30,25 @@
     <w:p>
       <w:pPr>
         <w:rPr>
+          <w:rFonts w:ascii="BritishRailDarkNormal" w:hAnsi="BritishRailDarkNormal" w:cs="Arial"/>
+        </w:rPr>
+      </w:pPr>
+      <w:r>
+        <w:rPr>
+          <w:rFonts w:ascii="BritishRailDarkNormal" w:hAnsi="BritishRailDarkNormal" w:cs="Arial"/>
+        </w:rPr>
+        <w:t xml:space="preserve">Date: </w:t>
+      </w:r>
+      <w:r>
+        <w:rPr>
+          <w:rFonts w:ascii="BritishRailDarkNormal" w:hAnsi="BritishRailDarkNormal" w:cs="Arial"/>
+        </w:rPr>
+        <w:t>0</w:t>
+      </w:r>
+      <w:r>
+        <w:rPr>
           <w:rFonts w:ascii="BritishRailDarkNormal" w:hAnsi="BritishRailDarkNormal" w:cs="Arial" w:hint="eastAsia"/>
         </w:rPr>
-      </w:pPr>
-      <w:r>
-        <w:rPr>
-          <w:rFonts w:ascii="BritishRailDarkNormal" w:hAnsi="BritishRailDarkNormal" w:cs="Arial"/>
-        </w:rPr>
-        <w:t xml:space="preserve">Date: </w:t>
-      </w:r>
-      <w:r>
-        <w:rPr>
-          <w:rFonts w:ascii="BritishRailDarkNormal" w:hAnsi="BritishRailDarkNormal" w:cs="Arial"/>
-        </w:rPr>
-        <w:t>0</w:t>
-      </w:r>
-      <w:r>
-        <w:rPr>
-          <w:rFonts w:ascii="BritishRailDarkNormal" w:hAnsi="BritishRailDarkNormal" w:cs="Arial" w:hint="eastAsia"/>
-        </w:rPr>
         <w:t>9</w:t>
       </w:r>
       <w:r>
@@ -128,7 +128,7 @@
     <w:p>
       <w:pPr>
         <w:rPr>
-          <w:rFonts w:ascii="BritishRailDarkNormal" w:hAnsi="BritishRailDarkNormal" w:cs="Arial" w:hint="eastAsia"/>
+          <w:rFonts w:ascii="BritishRailDarkNormal" w:hAnsi="BritishRailDarkNormal" w:cs="Arial"/>
         </w:rPr>
       </w:pPr>
       <w:r>
@@ -179,7 +179,7 @@
         <w:pStyle w:val="a9"/>
         <w:ind w:left="480"/>
         <w:rPr>
-          <w:rFonts w:ascii="BritishRailDarkNormal" w:hAnsi="BritishRailDarkNormal" w:cs="Arial" w:hint="eastAsia"/>
+          <w:rFonts w:ascii="BritishRailDarkNormal" w:hAnsi="BritishRailDarkNormal" w:cs="Arial"/>
         </w:rPr>
       </w:pPr>
       <w:r>
@@ -273,7 +273,6 @@
         <w:rPr>
           <w:rFonts w:ascii="BritishRailDarkNormal" w:hAnsi="BritishRailDarkNormal" w:cs="Arial"/>
         </w:rPr>
-        <w:lastRenderedPageBreak/>
         <w:t>However,</w:t>
       </w:r>
       <w:r>
@@ -355,6 +354,24 @@
         <w:ind w:left="480"/>
         <w:rPr>
           <w:rFonts w:ascii="BritishRailDarkNormal" w:hAnsi="BritishRailDarkNormal" w:cs="Arial"/>
+        </w:rPr>
+      </w:pPr>
+    </w:p>
+    <w:p>
+      <w:pPr>
+        <w:pStyle w:val="a9"/>
+        <w:ind w:left="480"/>
+        <w:rPr>
+          <w:rFonts w:ascii="BritishRailDarkNormal" w:hAnsi="BritishRailDarkNormal" w:cs="Arial"/>
+        </w:rPr>
+      </w:pPr>
+    </w:p>
+    <w:p>
+      <w:pPr>
+        <w:pStyle w:val="a9"/>
+        <w:ind w:left="480"/>
+        <w:rPr>
+          <w:rFonts w:ascii="BritishRailDarkNormal" w:hAnsi="BritishRailDarkNormal" w:cs="Arial" w:hint="eastAsia"/>
         </w:rPr>
       </w:pPr>
     </w:p>
@@ -373,6 +390,7 @@
         <w:rPr>
           <w:rFonts w:ascii="BritishRailDarkNormal" w:hAnsi="BritishRailDarkNormal" w:cs="Arial"/>
         </w:rPr>
+        <w:lastRenderedPageBreak/>
         <w:t>Level testing:</w:t>
       </w:r>
     </w:p>
@@ -390,9 +408,9 @@
           <w:noProof/>
         </w:rPr>
         <w:drawing>
-          <wp:inline distT="0" distB="0" distL="0" distR="0" wp14:anchorId="5B209014" wp14:editId="7821F633">
-            <wp:extent cx="3032760" cy="1442060"/>
-            <wp:effectExtent l="0" t="0" r="0" b="6350"/>
+          <wp:inline distT="0" distB="0" distL="0" distR="0" wp14:anchorId="5B209014" wp14:editId="44ADFBE7">
+            <wp:extent cx="5402580" cy="2568896"/>
+            <wp:effectExtent l="0" t="0" r="7620" b="3175"/>
             <wp:docPr id="473992410" name="圖片 1" descr="一張含有 文字, 螢幕擷取畫面, 字型, 數字 的圖片&#10;&#10;AI 產生的內容可能不正確。"/>
             <wp:cNvGraphicFramePr>
               <a:graphicFrameLocks xmlns:a="http://schemas.openxmlformats.org/drawingml/2006/main" noChangeAspect="1"/>
@@ -422,7 +440,7 @@
                   <pic:spPr bwMode="auto">
                     <a:xfrm>
                       <a:off x="0" y="0"/>
-                      <a:ext cx="3041801" cy="1446359"/>
+                      <a:ext cx="5432048" cy="2582908"/>
                     </a:xfrm>
                     <a:prstGeom prst="rect">
                       <a:avLst/>
@@ -529,6 +547,78 @@
     <w:p>
       <w:pPr>
         <w:pStyle w:val="a9"/>
+        <w:ind w:left="480"/>
+        <w:rPr>
+          <w:rFonts w:ascii="BritishRailDarkNormal" w:hAnsi="BritishRailDarkNormal" w:cs="Arial"/>
+        </w:rPr>
+      </w:pPr>
+    </w:p>
+    <w:p>
+      <w:pPr>
+        <w:pStyle w:val="a9"/>
+        <w:ind w:left="480"/>
+        <w:rPr>
+          <w:rFonts w:ascii="BritishRailDarkNormal" w:hAnsi="BritishRailDarkNormal" w:cs="Arial"/>
+        </w:rPr>
+      </w:pPr>
+    </w:p>
+    <w:p>
+      <w:pPr>
+        <w:pStyle w:val="a9"/>
+        <w:ind w:left="480"/>
+        <w:rPr>
+          <w:rFonts w:ascii="BritishRailDarkNormal" w:hAnsi="BritishRailDarkNormal" w:cs="Arial"/>
+        </w:rPr>
+      </w:pPr>
+    </w:p>
+    <w:p>
+      <w:pPr>
+        <w:pStyle w:val="a9"/>
+        <w:ind w:left="480"/>
+        <w:rPr>
+          <w:rFonts w:ascii="BritishRailDarkNormal" w:hAnsi="BritishRailDarkNormal" w:cs="Arial"/>
+        </w:rPr>
+      </w:pPr>
+    </w:p>
+    <w:p>
+      <w:pPr>
+        <w:pStyle w:val="a9"/>
+        <w:ind w:left="480"/>
+        <w:rPr>
+          <w:rFonts w:ascii="BritishRailDarkNormal" w:hAnsi="BritishRailDarkNormal" w:cs="Arial"/>
+        </w:rPr>
+      </w:pPr>
+    </w:p>
+    <w:p>
+      <w:pPr>
+        <w:pStyle w:val="a9"/>
+        <w:ind w:left="480"/>
+        <w:rPr>
+          <w:rFonts w:ascii="BritishRailDarkNormal" w:hAnsi="BritishRailDarkNormal" w:cs="Arial"/>
+        </w:rPr>
+      </w:pPr>
+    </w:p>
+    <w:p>
+      <w:pPr>
+        <w:pStyle w:val="a9"/>
+        <w:ind w:left="480"/>
+        <w:rPr>
+          <w:rFonts w:ascii="BritishRailDarkNormal" w:hAnsi="BritishRailDarkNormal" w:cs="Arial"/>
+        </w:rPr>
+      </w:pPr>
+    </w:p>
+    <w:p>
+      <w:pPr>
+        <w:pStyle w:val="a9"/>
+        <w:ind w:left="480"/>
+        <w:rPr>
+          <w:rFonts w:ascii="BritishRailDarkNormal" w:hAnsi="BritishRailDarkNormal" w:cs="Arial" w:hint="eastAsia"/>
+        </w:rPr>
+      </w:pPr>
+    </w:p>
+    <w:p>
+      <w:pPr>
+        <w:pStyle w:val="a9"/>
         <w:numPr>
           <w:ilvl w:val="0"/>
           <w:numId w:val="1"/>
@@ -541,6 +631,7 @@
         <w:rPr>
           <w:rFonts w:ascii="BritishRailDarkNormal" w:hAnsi="BritishRailDarkNormal" w:cs="Arial"/>
         </w:rPr>
+        <w:lastRenderedPageBreak/>
         <w:t>Game play Testing Debug log:</w:t>
       </w:r>
     </w:p>
@@ -557,7 +648,6 @@
           <w:rFonts w:ascii="BritishRailDarkNormal" w:hAnsi="BritishRailDarkNormal" w:cs="Arial"/>
           <w:noProof/>
         </w:rPr>
-        <w:lastRenderedPageBreak/>
         <w:drawing>
           <wp:inline distT="0" distB="0" distL="0" distR="0" wp14:anchorId="1D81A4EA" wp14:editId="5616C86E">
             <wp:extent cx="5489753" cy="2125980"/>
@@ -744,6 +834,7 @@
           <w:lang w:val="en-GB"/>
         </w:rPr>
       </w:pPr>
+      <w:proofErr w:type="gramStart"/>
       <w:r>
         <w:rPr>
           <w:rFonts w:ascii="BritishRailDarkNormal" w:hAnsi="BritishRailDarkNormal" w:cs="Arial"/>
@@ -751,6 +842,7 @@
         </w:rPr>
         <w:t>Dev  mode</w:t>
       </w:r>
+      <w:proofErr w:type="gramEnd"/>
     </w:p>
     <w:p>
       <w:pPr>
@@ -771,6 +863,41 @@
       <w:pPr>
         <w:rPr>
           <w:rFonts w:ascii="BritishRailDarkNormal" w:hAnsi="BritishRailDarkNormal" w:cs="Arial"/>
+        </w:rPr>
+      </w:pPr>
+    </w:p>
+    <w:p>
+      <w:pPr>
+        <w:rPr>
+          <w:rFonts w:ascii="BritishRailDarkNormal" w:hAnsi="BritishRailDarkNormal" w:cs="Arial"/>
+        </w:rPr>
+      </w:pPr>
+    </w:p>
+    <w:p>
+      <w:pPr>
+        <w:rPr>
+          <w:rFonts w:ascii="BritishRailDarkNormal" w:hAnsi="BritishRailDarkNormal" w:cs="Arial"/>
+        </w:rPr>
+      </w:pPr>
+    </w:p>
+    <w:p>
+      <w:pPr>
+        <w:rPr>
+          <w:rFonts w:ascii="BritishRailDarkNormal" w:hAnsi="BritishRailDarkNormal" w:cs="Arial"/>
+        </w:rPr>
+      </w:pPr>
+    </w:p>
+    <w:p>
+      <w:pPr>
+        <w:rPr>
+          <w:rFonts w:ascii="BritishRailDarkNormal" w:hAnsi="BritishRailDarkNormal" w:cs="Arial"/>
+        </w:rPr>
+      </w:pPr>
+    </w:p>
+    <w:p>
+      <w:pPr>
+        <w:rPr>
+          <w:rFonts w:ascii="BritishRailDarkNormal" w:hAnsi="BritishRailDarkNormal" w:cs="Arial" w:hint="eastAsia"/>
         </w:rPr>
       </w:pPr>
     </w:p>
@@ -789,16 +916,25 @@
         <w:rPr>
           <w:rFonts w:ascii="BritishRailDarkNormal" w:hAnsi="BritishRailDarkNormal" w:cs="Arial"/>
         </w:rPr>
+        <w:lastRenderedPageBreak/>
         <w:t>Semantic and stylistic Test with Lint:</w:t>
       </w:r>
+    </w:p>
+    <w:p>
+      <w:pPr>
+        <w:pStyle w:val="a9"/>
+        <w:ind w:left="480"/>
+        <w:rPr>
+          <w:rFonts w:ascii="BritishRailDarkNormal" w:hAnsi="BritishRailDarkNormal" w:cs="Arial"/>
+        </w:rPr>
+      </w:pPr>
       <w:r>
         <w:rPr>
           <w:rFonts w:ascii="BritishRailDarkNormal" w:hAnsi="BritishRailDarkNormal" w:cs="Arial"/>
           <w:noProof/>
         </w:rPr>
-        <w:lastRenderedPageBreak/>
         <w:drawing>
-          <wp:inline distT="0" distB="0" distL="0" distR="0" wp14:anchorId="61D8F241" wp14:editId="716D2B09">
+          <wp:inline distT="0" distB="0" distL="0" distR="0" wp14:anchorId="159E92D7" wp14:editId="7F7403F7">
             <wp:extent cx="7094284" cy="2987040"/>
             <wp:effectExtent l="0" t="0" r="0" b="3810"/>
             <wp:docPr id="242766449" name="圖片 2" descr="一張含有 文字, 螢幕擷取畫面, 軟體, 多媒體軟體 的圖片&#10;&#10;AI 產生的內容可能不正確。"/>
@@ -846,15 +982,6 @@
           </wp:inline>
         </w:drawing>
       </w:r>
-    </w:p>
-    <w:p>
-      <w:pPr>
-        <w:pStyle w:val="a9"/>
-        <w:ind w:left="480"/>
-        <w:rPr>
-          <w:rFonts w:ascii="BritishRailDarkNormal" w:hAnsi="BritishRailDarkNormal" w:cs="Arial"/>
-        </w:rPr>
-      </w:pPr>
       <w:hyperlink r:id="rId11" w:history="1">
         <w:r>
           <w:rPr>
@@ -934,6 +1061,60 @@
     <w:p>
       <w:pPr>
         <w:pStyle w:val="a9"/>
+        <w:ind w:left="480"/>
+        <w:rPr>
+          <w:rFonts w:ascii="BritishRailDarkNormal" w:hAnsi="BritishRailDarkNormal" w:cs="Arial"/>
+        </w:rPr>
+      </w:pPr>
+    </w:p>
+    <w:p>
+      <w:pPr>
+        <w:pStyle w:val="a9"/>
+        <w:ind w:left="480"/>
+        <w:rPr>
+          <w:rFonts w:ascii="BritishRailDarkNormal" w:hAnsi="BritishRailDarkNormal" w:cs="Arial"/>
+        </w:rPr>
+      </w:pPr>
+    </w:p>
+    <w:p>
+      <w:pPr>
+        <w:pStyle w:val="a9"/>
+        <w:ind w:left="480"/>
+        <w:rPr>
+          <w:rFonts w:ascii="BritishRailDarkNormal" w:hAnsi="BritishRailDarkNormal" w:cs="Arial"/>
+        </w:rPr>
+      </w:pPr>
+    </w:p>
+    <w:p>
+      <w:pPr>
+        <w:pStyle w:val="a9"/>
+        <w:ind w:left="480"/>
+        <w:rPr>
+          <w:rFonts w:ascii="BritishRailDarkNormal" w:hAnsi="BritishRailDarkNormal" w:cs="Arial"/>
+        </w:rPr>
+      </w:pPr>
+    </w:p>
+    <w:p>
+      <w:pPr>
+        <w:pStyle w:val="a9"/>
+        <w:ind w:left="480"/>
+        <w:rPr>
+          <w:rFonts w:ascii="BritishRailDarkNormal" w:hAnsi="BritishRailDarkNormal" w:cs="Arial"/>
+        </w:rPr>
+      </w:pPr>
+    </w:p>
+    <w:p>
+      <w:pPr>
+        <w:pStyle w:val="a9"/>
+        <w:ind w:left="480"/>
+        <w:rPr>
+          <w:rFonts w:ascii="BritishRailDarkNormal" w:hAnsi="BritishRailDarkNormal" w:cs="Arial" w:hint="eastAsia"/>
+        </w:rPr>
+      </w:pPr>
+    </w:p>
+    <w:p>
+      <w:pPr>
+        <w:pStyle w:val="a9"/>
         <w:numPr>
           <w:ilvl w:val="0"/>
           <w:numId w:val="1"/>
@@ -946,13 +1127,43 @@
         <w:rPr>
           <w:rFonts w:ascii="BritishRailDarkNormal" w:hAnsi="BritishRailDarkNormal" w:cs="Arial"/>
         </w:rPr>
+        <w:lastRenderedPageBreak/>
         <w:t>Test Code security results:</w:t>
       </w:r>
-      <w:r>
+    </w:p>
+    <w:p>
+      <w:pPr>
+        <w:pStyle w:val="a9"/>
+        <w:ind w:left="480"/>
         <w:rPr>
           <w:rFonts w:ascii="BritishRailDarkNormal" w:hAnsi="BritishRailDarkNormal" w:cs="Arial" w:hint="eastAsia"/>
         </w:rPr>
-        <w:t>\</w:t>
+      </w:pPr>
+      <w:r>
+        <w:rPr>
+          <w:rFonts w:ascii="BritishRailDarkNormal" w:hAnsi="BritishRailDarkNormal" w:cs="Arial"/>
+        </w:rPr>
+        <w:t>Screen</w:t>
+      </w:r>
+      <w:r>
+        <w:rPr>
+          <w:rFonts w:ascii="BritishRailDarkNormal" w:hAnsi="BritishRailDarkNormal" w:cs="Arial" w:hint="eastAsia"/>
+        </w:rPr>
+        <w:t xml:space="preserve"> short from </w:t>
+      </w:r>
+      <w:proofErr w:type="spellStart"/>
+      <w:r>
+        <w:rPr>
+          <w:rFonts w:ascii="BritishRailDarkNormal" w:hAnsi="BritishRailDarkNormal" w:cs="Arial" w:hint="eastAsia"/>
+        </w:rPr>
+        <w:t>Github</w:t>
+      </w:r>
+      <w:proofErr w:type="spellEnd"/>
+      <w:r>
+        <w:rPr>
+          <w:rFonts w:ascii="BritishRailDarkNormal" w:hAnsi="BritishRailDarkNormal" w:cs="Arial" w:hint="eastAsia"/>
+        </w:rPr>
+        <w:t xml:space="preserve"> </w:t>
       </w:r>
     </w:p>
     <w:p>
@@ -968,10 +1179,9 @@
           <w:rFonts w:ascii="BritishRailDarkNormal" w:hAnsi="BritishRailDarkNormal" w:cs="Arial"/>
           <w:noProof/>
         </w:rPr>
-        <w:lastRenderedPageBreak/>
         <w:drawing>
-          <wp:inline distT="0" distB="0" distL="0" distR="0" wp14:anchorId="6EB493D6" wp14:editId="209869D0">
-            <wp:extent cx="5779798" cy="3337560"/>
+          <wp:inline distT="0" distB="0" distL="0" distR="0" wp14:anchorId="6EB493D6" wp14:editId="29001FD2">
+            <wp:extent cx="5128260" cy="2961327"/>
             <wp:effectExtent l="0" t="0" r="0" b="0"/>
             <wp:docPr id="1545054695" name="圖片 3" descr="一張含有 文字, 螢幕擷取畫面, 字型, 數字 的圖片&#10;&#10;AI 產生的內容可能不正確。"/>
             <wp:cNvGraphicFramePr>
@@ -987,7 +1197,7 @@
                     </pic:cNvPicPr>
                   </pic:nvPicPr>
                   <pic:blipFill>
-                    <a:blip r:embed="rId13">
+                    <a:blip r:embed="rId13" cstate="print">
                       <a:extLst>
                         <a:ext uri="{28A0092B-C50C-407E-A947-70E740481C1C}">
                           <a14:useLocalDpi xmlns:a14="http://schemas.microsoft.com/office/drawing/2010/main" val="0"/>
@@ -1002,7 +1212,7 @@
                   <pic:spPr bwMode="auto">
                     <a:xfrm>
                       <a:off x="0" y="0"/>
-                      <a:ext cx="5783444" cy="3339665"/>
+                      <a:ext cx="5133865" cy="2964563"/>
                     </a:xfrm>
                     <a:prstGeom prst="rect">
                       <a:avLst/>
@@ -1024,10 +1234,108 @@
         <w:pStyle w:val="a9"/>
         <w:ind w:left="480"/>
         <w:rPr>
-          <w:rFonts w:ascii="BritishRailDarkNormal" w:hAnsi="BritishRailDarkNormal" w:cs="Arial"/>
-        </w:rPr>
-      </w:pPr>
-      <w:hyperlink r:id="rId14" w:tgtFrame="_blank" w:tooltip="https://github.com/PyCQA/bandit" w:history="1">
+          <w:rFonts w:ascii="BritishRailDarkNormal" w:hAnsi="BritishRailDarkNormal" w:cs="Arial" w:hint="eastAsia"/>
+        </w:rPr>
+      </w:pPr>
+      <w:r>
+        <w:rPr>
+          <w:rFonts w:ascii="BritishRailDarkNormal" w:hAnsi="BritishRailDarkNormal" w:cs="Arial"/>
+        </w:rPr>
+        <w:t>Screen</w:t>
+      </w:r>
+      <w:r>
+        <w:rPr>
+          <w:rFonts w:ascii="BritishRailDarkNormal" w:hAnsi="BritishRailDarkNormal" w:cs="Arial" w:hint="eastAsia"/>
+        </w:rPr>
+        <w:t xml:space="preserve"> short from </w:t>
+      </w:r>
+      <w:proofErr w:type="spellStart"/>
+      <w:r>
+        <w:rPr>
+          <w:rFonts w:ascii="BritishRailDarkNormal" w:hAnsi="BritishRailDarkNormal" w:cs="Arial" w:hint="eastAsia"/>
+        </w:rPr>
+        <w:t>VScode</w:t>
+      </w:r>
+      <w:proofErr w:type="spellEnd"/>
+      <w:r>
+        <w:rPr>
+          <w:rFonts w:ascii="BritishRailDarkNormal" w:hAnsi="BritishRailDarkNormal" w:cs="Arial" w:hint="eastAsia"/>
+        </w:rPr>
+        <w:t xml:space="preserve"> with</w:t>
+      </w:r>
+    </w:p>
+    <w:p>
+      <w:pPr>
+        <w:pStyle w:val="a9"/>
+        <w:ind w:left="480"/>
+        <w:rPr>
+          <w:rFonts w:ascii="BritishRailDarkNormal" w:hAnsi="BritishRailDarkNormal" w:cs="Arial" w:hint="eastAsia"/>
+        </w:rPr>
+      </w:pPr>
+      <w:r>
+        <w:rPr>
+          <w:rFonts w:ascii="BritishRailDarkNormal" w:hAnsi="BritishRailDarkNormal" w:cs="Arial"/>
+          <w:noProof/>
+        </w:rPr>
+        <w:drawing>
+          <wp:inline distT="0" distB="0" distL="0" distR="0" wp14:anchorId="2A9CD00C" wp14:editId="00A73099">
+            <wp:extent cx="5379720" cy="2745416"/>
+            <wp:effectExtent l="0" t="0" r="0" b="0"/>
+            <wp:docPr id="1007263425" name="圖片 1" descr="一張含有 文字, 螢幕擷取畫面, 軟體, 多媒體軟體 的圖片&#10;&#10;AI 產生的內容可能不正確。"/>
+            <wp:cNvGraphicFramePr>
+              <a:graphicFrameLocks xmlns:a="http://schemas.openxmlformats.org/drawingml/2006/main" noChangeAspect="1"/>
+            </wp:cNvGraphicFramePr>
+            <a:graphic xmlns:a="http://schemas.openxmlformats.org/drawingml/2006/main">
+              <a:graphicData uri="http://schemas.openxmlformats.org/drawingml/2006/picture">
+                <pic:pic xmlns:pic="http://schemas.openxmlformats.org/drawingml/2006/picture">
+                  <pic:nvPicPr>
+                    <pic:cNvPr id="1007263425" name="圖片 1" descr="一張含有 文字, 螢幕擷取畫面, 軟體, 多媒體軟體 的圖片&#10;&#10;AI 產生的內容可能不正確。"/>
+                    <pic:cNvPicPr>
+                      <a:picLocks noChangeAspect="1" noChangeArrowheads="1"/>
+                    </pic:cNvPicPr>
+                  </pic:nvPicPr>
+                  <pic:blipFill>
+                    <a:blip r:embed="rId14" cstate="print">
+                      <a:extLst>
+                        <a:ext uri="{28A0092B-C50C-407E-A947-70E740481C1C}">
+                          <a14:useLocalDpi xmlns:a14="http://schemas.microsoft.com/office/drawing/2010/main" val="0"/>
+                        </a:ext>
+                      </a:extLst>
+                    </a:blip>
+                    <a:srcRect/>
+                    <a:stretch>
+                      <a:fillRect/>
+                    </a:stretch>
+                  </pic:blipFill>
+                  <pic:spPr bwMode="auto">
+                    <a:xfrm>
+                      <a:off x="0" y="0"/>
+                      <a:ext cx="5401416" cy="2756488"/>
+                    </a:xfrm>
+                    <a:prstGeom prst="rect">
+                      <a:avLst/>
+                    </a:prstGeom>
+                    <a:noFill/>
+                    <a:ln>
+                      <a:noFill/>
+                    </a:ln>
+                  </pic:spPr>
+                </pic:pic>
+              </a:graphicData>
+            </a:graphic>
+          </wp:inline>
+        </w:drawing>
+      </w:r>
+    </w:p>
+    <w:p>
+      <w:pPr>
+        <w:pStyle w:val="a9"/>
+        <w:ind w:left="480"/>
+        <w:rPr>
+          <w:rFonts w:ascii="BritishRailDarkNormal" w:hAnsi="BritishRailDarkNormal" w:cs="Arial"/>
+        </w:rPr>
+      </w:pPr>
+      <w:hyperlink r:id="rId15" w:tgtFrame="_blank" w:tooltip="https://github.com/PyCQA/bandit" w:history="1">
         <w:r>
           <w:rPr>
             <w:rStyle w:val="ae"/>
@@ -1042,12 +1350,14 @@
         </w:rPr>
         <w:t xml:space="preserve">  </w:t>
       </w:r>
+      <w:proofErr w:type="spellStart"/>
       <w:r>
         <w:rPr>
           <w:rFonts w:ascii="BritishRailDarkNormal" w:hAnsi="BritishRailDarkNormal" w:cs="Arial"/>
         </w:rPr>
         <w:t>Github</w:t>
       </w:r>
+      <w:proofErr w:type="spellEnd"/>
     </w:p>
     <w:p>
       <w:pPr>
@@ -1057,46 +1367,255 @@
           <w:rFonts w:cs="Arial"/>
         </w:rPr>
       </w:pPr>
-      <w:r>
+      <w:hyperlink r:id="rId16" w:history="1">
+        <w:r>
+          <w:rPr>
+            <w:rStyle w:val="ae"/>
+            <w:rFonts w:cs="Arial"/>
+          </w:rPr>
+          <w:t>https://github.com/Minosaji/Software-Engineering-Project/actions/workflows/bandit%20security%20linter.yml</w:t>
+        </w:r>
+      </w:hyperlink>
+    </w:p>
+    <w:p>
+      <w:pPr>
+        <w:pStyle w:val="a9"/>
+        <w:ind w:left="480"/>
+        <w:rPr>
+          <w:rFonts w:cs="Arial" w:hint="eastAsia"/>
+        </w:rPr>
+      </w:pPr>
+    </w:p>
+    <w:p>
+      <w:pPr>
+        <w:pStyle w:val="a9"/>
+        <w:ind w:left="480"/>
+        <w:rPr>
+          <w:rFonts w:ascii="BritishRailDarkNormal" w:hAnsi="BritishRailDarkNormal" w:cs="Arial"/>
+        </w:rPr>
+      </w:pPr>
+      <w:r>
+        <w:rPr>
+          <w:rFonts w:ascii="BritishRailDarkNormal" w:hAnsi="BritishRailDarkNormal" w:cs="Arial"/>
+        </w:rPr>
+        <w:t xml:space="preserve">a code scanning result (in the format of </w:t>
+      </w:r>
+      <w:proofErr w:type="gramStart"/>
+      <w:r>
+        <w:rPr>
+          <w:rFonts w:ascii="BritishRailDarkNormal" w:hAnsi="BritishRailDarkNormal" w:cs="Arial"/>
+        </w:rPr>
+        <w:t>a .</w:t>
+      </w:r>
+      <w:proofErr w:type="gramEnd"/>
+      <w:r>
+        <w:rPr>
+          <w:rFonts w:ascii="BritishRailDarkNormal" w:hAnsi="BritishRailDarkNormal" w:cs="Arial"/>
+        </w:rPr>
+        <w:t xml:space="preserve"> </w:t>
+      </w:r>
+      <w:r>
+        <w:rPr>
+          <w:rFonts w:ascii="BritishRailDarkNormal" w:hAnsi="BritishRailDarkNormal" w:cs="Arial"/>
+        </w:rPr>
+        <w:t>SARIF file) using GitHub Actions.</w:t>
+      </w:r>
+    </w:p>
+    <w:p>
+      <w:pPr>
+        <w:pStyle w:val="a9"/>
+        <w:ind w:left="480"/>
         <w:rPr>
           <w:rFonts w:cs="Arial"/>
         </w:rPr>
-        <w:t>https://github.com/Minosaji/Software-Engineering-Project/actions/workflows/bandit%20security%20linter.yml</w:t>
-      </w:r>
-    </w:p>
-    <w:p>
-      <w:pPr>
-        <w:pStyle w:val="a9"/>
-        <w:ind w:left="480"/>
-        <w:rPr>
-          <w:rFonts w:ascii="BritishRailDarkNormal" w:hAnsi="BritishRailDarkNormal" w:cs="Arial"/>
-        </w:rPr>
-      </w:pPr>
-      <w:r>
-        <w:rPr>
-          <w:rFonts w:ascii="BritishRailDarkNormal" w:hAnsi="BritishRailDarkNormal" w:cs="Arial"/>
-        </w:rPr>
-        <w:t>a code scanning result (in the format of a .</w:t>
-      </w:r>
-      <w:r>
-        <w:rPr>
-          <w:rFonts w:ascii="BritishRailDarkNormal" w:hAnsi="BritishRailDarkNormal" w:cs="Arial"/>
-        </w:rPr>
-        <w:t xml:space="preserve"> </w:t>
-      </w:r>
-      <w:r>
-        <w:rPr>
-          <w:rFonts w:ascii="BritishRailDarkNormal" w:hAnsi="BritishRailDarkNormal" w:cs="Arial"/>
-        </w:rPr>
-        <w:t>SARIF file) using GitHub Actions.</w:t>
-      </w:r>
-    </w:p>
-    <w:p>
-      <w:pPr>
-        <w:pStyle w:val="a9"/>
-        <w:ind w:left="480"/>
-        <w:rPr>
-          <w:rFonts w:ascii="BritishRailDarkNormal" w:hAnsi="BritishRailDarkNormal" w:cs="Arial"/>
+      </w:pPr>
+      <w:hyperlink r:id="rId17" w:history="1">
+        <w:r>
+          <w:rPr>
+            <w:rStyle w:val="ae"/>
+            <w:rFonts w:cs="Arial"/>
+          </w:rPr>
+          <w:t>https://marketplace.visualstudio.com/items/?itemName=MS-SarifVSCode.sarif-viewer</w:t>
+        </w:r>
+      </w:hyperlink>
+    </w:p>
+    <w:p>
+      <w:pPr>
+        <w:pStyle w:val="a9"/>
+        <w:ind w:left="480"/>
+        <w:rPr>
+          <w:rFonts w:cs="Arial"/>
+        </w:rPr>
+      </w:pPr>
+    </w:p>
+    <w:p>
+      <w:pPr>
+        <w:pStyle w:val="a9"/>
+        <w:ind w:left="480"/>
+        <w:rPr>
+          <w:rFonts w:cs="Arial"/>
+        </w:rPr>
+      </w:pPr>
+    </w:p>
+    <w:p>
+      <w:pPr>
+        <w:pStyle w:val="a9"/>
+        <w:ind w:left="480"/>
+        <w:rPr>
+          <w:rFonts w:cs="Arial"/>
+        </w:rPr>
+      </w:pPr>
+    </w:p>
+    <w:p>
+      <w:pPr>
+        <w:pStyle w:val="a9"/>
+        <w:ind w:left="480"/>
+        <w:rPr>
+          <w:rFonts w:cs="Arial"/>
+        </w:rPr>
+      </w:pPr>
+    </w:p>
+    <w:p>
+      <w:pPr>
+        <w:pStyle w:val="a9"/>
+        <w:ind w:left="480"/>
+        <w:rPr>
+          <w:rFonts w:cs="Arial"/>
+        </w:rPr>
+      </w:pPr>
+    </w:p>
+    <w:p>
+      <w:pPr>
+        <w:pStyle w:val="a9"/>
+        <w:ind w:left="480"/>
+        <w:rPr>
+          <w:rFonts w:cs="Arial"/>
+        </w:rPr>
+      </w:pPr>
+    </w:p>
+    <w:p>
+      <w:pPr>
+        <w:pStyle w:val="a9"/>
+        <w:ind w:left="480"/>
+        <w:rPr>
+          <w:rFonts w:cs="Arial"/>
+        </w:rPr>
+      </w:pPr>
+    </w:p>
+    <w:p>
+      <w:pPr>
+        <w:pStyle w:val="a9"/>
+        <w:ind w:left="480"/>
+        <w:rPr>
+          <w:rFonts w:cs="Arial"/>
+        </w:rPr>
+      </w:pPr>
+    </w:p>
+    <w:p>
+      <w:pPr>
+        <w:pStyle w:val="a9"/>
+        <w:ind w:left="480"/>
+        <w:rPr>
+          <w:rFonts w:cs="Arial"/>
+        </w:rPr>
+      </w:pPr>
+    </w:p>
+    <w:p>
+      <w:pPr>
+        <w:pStyle w:val="a9"/>
+        <w:ind w:left="480"/>
+        <w:rPr>
+          <w:rFonts w:cs="Arial"/>
+        </w:rPr>
+      </w:pPr>
+    </w:p>
+    <w:p>
+      <w:pPr>
+        <w:pStyle w:val="a9"/>
+        <w:ind w:left="480"/>
+        <w:rPr>
+          <w:rFonts w:cs="Arial"/>
+        </w:rPr>
+      </w:pPr>
+    </w:p>
+    <w:p>
+      <w:pPr>
+        <w:pStyle w:val="a9"/>
+        <w:ind w:left="480"/>
+        <w:rPr>
+          <w:rFonts w:cs="Arial"/>
+        </w:rPr>
+      </w:pPr>
+    </w:p>
+    <w:p>
+      <w:pPr>
+        <w:pStyle w:val="a9"/>
+        <w:ind w:left="480"/>
+        <w:rPr>
+          <w:rFonts w:cs="Arial"/>
+        </w:rPr>
+      </w:pPr>
+    </w:p>
+    <w:p>
+      <w:pPr>
+        <w:pStyle w:val="a9"/>
+        <w:ind w:left="480"/>
+        <w:rPr>
+          <w:rFonts w:cs="Arial"/>
+        </w:rPr>
+      </w:pPr>
+    </w:p>
+    <w:p>
+      <w:pPr>
+        <w:pStyle w:val="a9"/>
+        <w:ind w:left="480"/>
+        <w:rPr>
+          <w:rFonts w:cs="Arial"/>
+        </w:rPr>
+      </w:pPr>
+    </w:p>
+    <w:p>
+      <w:pPr>
+        <w:pStyle w:val="a9"/>
+        <w:ind w:left="480"/>
+        <w:rPr>
+          <w:rFonts w:cs="Arial"/>
+        </w:rPr>
+      </w:pPr>
+    </w:p>
+    <w:p>
+      <w:pPr>
+        <w:pStyle w:val="a9"/>
+        <w:ind w:left="480"/>
+        <w:rPr>
+          <w:rFonts w:cs="Arial"/>
+        </w:rPr>
+      </w:pPr>
+    </w:p>
+    <w:p>
+      <w:pPr>
+        <w:pStyle w:val="a9"/>
+        <w:ind w:left="480"/>
+        <w:rPr>
+          <w:rFonts w:cs="Arial"/>
+        </w:rPr>
+      </w:pPr>
+    </w:p>
+    <w:p>
+      <w:pPr>
+        <w:pStyle w:val="a9"/>
+        <w:ind w:left="480"/>
+        <w:rPr>
+          <w:rFonts w:cs="Arial"/>
+        </w:rPr>
+      </w:pPr>
+    </w:p>
+    <w:p>
+      <w:pPr>
+        <w:pStyle w:val="a9"/>
+        <w:ind w:left="480"/>
+        <w:rPr>
+          <w:rFonts w:cs="Arial" w:hint="eastAsia"/>
         </w:rPr>
       </w:pPr>
     </w:p>
@@ -1115,6 +1634,7 @@
         <w:rPr>
           <w:rFonts w:ascii="BritishRailDarkNormal" w:hAnsi="BritishRailDarkNormal" w:cs="Arial"/>
         </w:rPr>
+        <w:lastRenderedPageBreak/>
         <w:t>Continuous Integration (CI)test using GitHub Actions</w:t>
       </w:r>
     </w:p>
@@ -1123,7 +1643,7 @@
         <w:pStyle w:val="a9"/>
         <w:ind w:left="480"/>
         <w:rPr>
-          <w:rFonts w:ascii="BritishRailDarkNormal" w:hAnsi="BritishRailDarkNormal" w:cs="Arial" w:hint="eastAsia"/>
+          <w:rFonts w:ascii="BritishRailDarkNormal" w:hAnsi="BritishRailDarkNormal" w:cs="Arial"/>
         </w:rPr>
       </w:pPr>
       <w:r>
@@ -1131,7 +1651,6 @@
           <w:rFonts w:ascii="BritishRailDarkNormal" w:hAnsi="BritishRailDarkNormal" w:cs="Arial"/>
           <w:noProof/>
         </w:rPr>
-        <w:lastRenderedPageBreak/>
         <w:drawing>
           <wp:inline distT="0" distB="0" distL="0" distR="0" wp14:anchorId="31F49BDE" wp14:editId="34FD0FF4">
             <wp:extent cx="8854440" cy="1882140"/>
@@ -1150,7 +1669,7 @@
                     </pic:cNvPicPr>
                   </pic:nvPicPr>
                   <pic:blipFill>
-                    <a:blip r:embed="rId15">
+                    <a:blip r:embed="rId18">
                       <a:extLst>
                         <a:ext uri="{28A0092B-C50C-407E-A947-70E740481C1C}">
                           <a14:useLocalDpi xmlns:a14="http://schemas.microsoft.com/office/drawing/2010/main" val="0"/>
@@ -1209,7 +1728,21 @@
         <w:rPr>
           <w:rFonts w:ascii="BritishRailDarkNormal" w:hAnsi="BritishRailDarkNormal" w:cs="Arial"/>
         </w:rPr>
-        <w:t xml:space="preserve">python-package.yml </w:t>
+        <w:t>python-</w:t>
+      </w:r>
+      <w:proofErr w:type="spellStart"/>
+      <w:r>
+        <w:rPr>
+          <w:rFonts w:ascii="BritishRailDarkNormal" w:hAnsi="BritishRailDarkNormal" w:cs="Arial"/>
+        </w:rPr>
+        <w:t>package.yml</w:t>
+      </w:r>
+      <w:proofErr w:type="spellEnd"/>
+      <w:r>
+        <w:rPr>
+          <w:rFonts w:ascii="BritishRailDarkNormal" w:hAnsi="BritishRailDarkNormal" w:cs="Arial"/>
+        </w:rPr>
+        <w:t xml:space="preserve"> </w:t>
       </w:r>
       <w:r>
         <w:rPr>
@@ -1229,7 +1762,7 @@
     </w:p>
     <w:sectPr>
       <w:pgSz w:w="16838" w:h="11906" w:orient="landscape"/>
-      <w:pgMar w:top="1800" w:right="1440" w:bottom="1800" w:left="1440" w:header="851" w:footer="992" w:gutter="0"/>
+      <w:pgMar w:top="720" w:right="720" w:bottom="720" w:left="720" w:header="851" w:footer="992" w:gutter="0"/>
       <w:cols w:space="425"/>
       <w:docGrid w:type="lines" w:linePitch="360"/>
     </w:sectPr>

</xml_diff>